<commit_message>
Finalize competition submission assets
</commit_message>
<xml_diff>
--- a/submission/HOUSEWIRE_PROJECT_DESCRIPTION.docx
+++ b/submission/HOUSEWIRE_PROJECT_DESCRIPTION.docx
@@ -622,7 +622,7 @@
         <w:spacing w:after="90"/>
       </w:pPr>
       <w:r>
-        <w:t>In our live LINE 13 demo, one person hosts and the others scan the in-app QR. One phone hears a knock sequence, another owns the matching glyph rule, and another becomes the courier. They must exchange what they know because no single screen can reveal the route. House Line carries a short voice burst or a no-microphone signal. The courier scans the next station while motion checks a steady carry. In the final beat, every active phone must lie flat inside the same short window before the host releases the ending. With one phone, solo rehearsal uses a role switcher but retains real answers, retries, hints, timing, validation, persistence, and debrief.</w:t>
+        <w:t>The submitted 2 minute 53 second walkthrough starts on the Home screen, moves through the First Light tutorial, opens Escape Cases, configures Case Forge, generates a GPT-backed room, solves its first scene, and reveals the next. It then completes one Family Frequency round and previews Circuit Race with the contextual AI hint guide. The recording may appear slightly laggy because screen capture adds overhead; during normal play, the app runs smoothly. For a live judge demo, solo rehearsal keeps real answers, retries, hints, timing, validation, persistence, and debrief on one phone. With multiple phones, family members scan the in-app QR or enter the house code, receive private roles, and combine clues and actions to finish together.</w:t>
       </w:r>
     </w:p>
     <w:p>
@@ -702,27 +702,7 @@
         <w:keepLines/>
       </w:pPr>
       <w:r>
-        <w:t>Why general purpose tools are different</w:t>
-      </w:r>
-    </w:p>
-    <w:p>
-      <w:pPr>
-        <w:pStyle w:val="BodyText"/>
-        <w:keepNext w:val="0"/>
-        <w:spacing w:after="90"/>
-      </w:pPr>
-      <w:r>
-        <w:t>WhatsApp can exchange messages, ChatGPT can generate prompts, and Calendar can reserve time. By themselves they do not assign secret roles, withhold per-player information, maintain host-authoritative state, validate camera or motion evidence, synchronize finish windows, or keep two teams on equivalent courses. Recreating a round would require a person to distribute clues, track state, judge actions, and police timing. We encode those rules and recovery paths in the game.</w:t>
-      </w:r>
-    </w:p>
-    <w:p>
-      <w:pPr>
-        <w:pStyle w:val="Heading1"/>
-        <w:keepNext/>
-        <w:keepLines/>
-      </w:pPr>
-      <w:r>
-        <w:t>Current limitations</w:t>
+        <w:t>Future work</w:t>
       </w:r>
     </w:p>
     <w:p>
@@ -732,16 +712,7 @@
         <w:ind w:left="288" w:hanging="230"/>
       </w:pPr>
       <w:r>
-        <w:rPr>
-          <w:rFonts w:ascii="Arial" w:hAnsi="Arial"/>
-          <w:b/>
-          <w:color w:val="173A56"/>
-          <w:sz w:val="19"/>
-        </w:rPr>
-        <w:t xml:space="preserve">•  </w:t>
-      </w:r>
-      <w:r>
-        <w:t>Live multi-phone play currently depends on the included host and relay, with every device on the same reachable network. Firewalls or client-isolated Wi-Fi can block joining or reconnecting.</w:t>
+        <w:t>- Online multiplayer will let relatives play together from different homes through secure invite links, private rooms, reconnectable sessions, and low-latency role audio while preserving local same-home play.</w:t>
       </w:r>
     </w:p>
     <w:p>
@@ -751,16 +722,7 @@
         <w:ind w:left="288" w:hanging="230"/>
       </w:pPr>
       <w:r>
-        <w:rPr>
-          <w:rFonts w:ascii="Arial" w:hAnsi="Arial"/>
-          <w:b/>
-          <w:color w:val="173A56"/>
-          <w:sz w:val="19"/>
-        </w:rPr>
-        <w:t xml:space="preserve">•  </w:t>
-      </w:r>
-      <w:r>
-        <w:t>Generative features require a configured server-side API key. The deterministic offline path remains playable, but it does not provide the same narrative or question variety.</w:t>
+        <w:t>- A Family Case Studio will turn optional room photos, chosen themes, age ranges, and available devices into privacy-controlled escape rooms tailored to each household.</w:t>
       </w:r>
     </w:p>
     <w:p>
@@ -770,16 +732,7 @@
         <w:ind w:left="288" w:hanging="230"/>
       </w:pPr>
       <w:r>
-        <w:rPr>
-          <w:rFonts w:ascii="Arial" w:hAnsi="Arial"/>
-          <w:b/>
-          <w:color w:val="173A56"/>
-          <w:sz w:val="19"/>
-        </w:rPr>
-        <w:t xml:space="preserve">•  </w:t>
-      </w:r>
-      <w:r>
-        <w:t>Camera, microphone, haptic, and motion behavior varies by phone and needs broader device testing. Manual fallbacks preserve play, although they are not identical to the sensor interaction.</w:t>
+        <w:t>- New interaction packs will add spatial camera clues, directional sound, proximity, and coordinated sensor sequences, each paired with accessible touch, caption, and low-motion alternatives.</w:t>
       </w:r>
     </w:p>
     <w:p>
@@ -789,16 +742,7 @@
         <w:ind w:left="288" w:hanging="230"/>
       </w:pPr>
       <w:r>
-        <w:rPr>
-          <w:rFonts w:ascii="Arial" w:hAnsi="Arial"/>
-          <w:b/>
-          <w:color w:val="173A56"/>
-          <w:sz w:val="19"/>
-        </w:rPr>
-        <w:t xml:space="preserve">•  </w:t>
-      </w:r>
-      <w:r>
-        <w:t>We have not shown that Housewire produces lasting relationship outcomes. Our present claim is narrower: its mechanics are designed to create shared communication and reliance during play.</w:t>
+        <w:t>- Persistent family leagues will support saved teams, rematches, rotating hosts, shared case libraries, and asynchronous challenge windows for families whose schedules rarely overlap.</w:t>
       </w:r>
     </w:p>
     <w:sectPr>

</xml_diff>